<commit_message>
fix(charts): incluir nome do modelo Meta Llama 3.2 e infraestrutura NVIDIA NIM nas figuras
</commit_message>
<xml_diff>
--- a/01 - Disciplinas/Trabalho de Conclusão de Curso II/01 - Manuscrito/TCC_II_Versao_1_Acompanhamento_Matheus_Santos.docx
+++ b/01 - Disciplinas/Trabalho de Conclusão de Curso II/01 - Manuscrito/TCC_II_Versao_1_Acompanhamento_Matheus_Santos.docx
@@ -4401,7 +4401,7 @@
       <w:r>
         <w:drawing>
           <wp:inline xmlns:a="http://schemas.openxmlformats.org/drawingml/2006/main" xmlns:pic="http://schemas.openxmlformats.org/drawingml/2006/picture">
-            <wp:extent cx="5040000" cy="2822400"/>
+            <wp:extent cx="5040000" cy="2907692"/>
             <wp:docPr id="1" name="Picture 1"/>
             <wp:cNvGraphicFramePr>
               <a:graphicFrameLocks noChangeAspect="1"/>
@@ -4422,7 +4422,7 @@
                   <pic:spPr>
                     <a:xfrm>
                       <a:off x="0" y="0"/>
-                      <a:ext cx="5040000" cy="2822400"/>
+                      <a:ext cx="5040000" cy="2907692"/>
                     </a:xfrm>
                     <a:prstGeom prst="rect"/>
                   </pic:spPr>
@@ -6620,7 +6620,7 @@
       <w:r>
         <w:drawing>
           <wp:inline xmlns:a="http://schemas.openxmlformats.org/drawingml/2006/main" xmlns:pic="http://schemas.openxmlformats.org/drawingml/2006/picture">
-            <wp:extent cx="5040000" cy="2822400"/>
+            <wp:extent cx="5040000" cy="2907692"/>
             <wp:docPr id="2" name="Picture 2"/>
             <wp:cNvGraphicFramePr>
               <a:graphicFrameLocks noChangeAspect="1"/>
@@ -6641,7 +6641,7 @@
                   <pic:spPr>
                     <a:xfrm>
                       <a:off x="0" y="0"/>
-                      <a:ext cx="5040000" cy="2822400"/>
+                      <a:ext cx="5040000" cy="2907692"/>
                     </a:xfrm>
                     <a:prstGeom prst="rect"/>
                   </pic:spPr>
@@ -8839,7 +8839,7 @@
       <w:r>
         <w:drawing>
           <wp:inline xmlns:a="http://schemas.openxmlformats.org/drawingml/2006/main" xmlns:pic="http://schemas.openxmlformats.org/drawingml/2006/picture">
-            <wp:extent cx="5040000" cy="2822400"/>
+            <wp:extent cx="5040000" cy="2907692"/>
             <wp:docPr id="3" name="Picture 3"/>
             <wp:cNvGraphicFramePr>
               <a:graphicFrameLocks noChangeAspect="1"/>
@@ -8860,7 +8860,7 @@
                   <pic:spPr>
                     <a:xfrm>
                       <a:off x="0" y="0"/>
-                      <a:ext cx="5040000" cy="2822400"/>
+                      <a:ext cx="5040000" cy="2907692"/>
                     </a:xfrm>
                     <a:prstGeom prst="rect"/>
                   </pic:spPr>
@@ -9818,7 +9818,7 @@
       <w:r>
         <w:drawing>
           <wp:inline xmlns:a="http://schemas.openxmlformats.org/drawingml/2006/main" xmlns:pic="http://schemas.openxmlformats.org/drawingml/2006/picture">
-            <wp:extent cx="5040000" cy="2822400"/>
+            <wp:extent cx="5040000" cy="2907692"/>
             <wp:docPr id="4" name="Picture 4"/>
             <wp:cNvGraphicFramePr>
               <a:graphicFrameLocks noChangeAspect="1"/>
@@ -9839,7 +9839,7 @@
                   <pic:spPr>
                     <a:xfrm>
                       <a:off x="0" y="0"/>
-                      <a:ext cx="5040000" cy="2822400"/>
+                      <a:ext cx="5040000" cy="2907692"/>
                     </a:xfrm>
                     <a:prstGeom prst="rect"/>
                   </pic:spPr>

</xml_diff>